<commit_message>
enhance appointment process & update  specification docs
</commit_message>
<xml_diff>
--- a/Specification.docx
+++ b/Specification.docx
@@ -1,6 +1,6 @@
 
 <file path=word/document.xml><?xml version="1.0" encoding="utf-8"?>
-<w:document xmlns:wpc="http://schemas.microsoft.com/office/word/2010/wordprocessingCanvas" xmlns:cx="http://schemas.microsoft.com/office/drawing/2014/chartex" xmlns:cx1="http://schemas.microsoft.com/office/drawing/2015/9/8/chartex" xmlns:cx2="http://schemas.microsoft.com/office/drawing/2015/10/21/chartex" xmlns:cx3="http://schemas.microsoft.com/office/drawing/2016/5/9/chartex" xmlns:cx4="http://schemas.microsoft.com/office/drawing/2016/5/10/chartex" xmlns:cx5="http://schemas.microsoft.com/office/drawing/2016/5/11/chartex" xmlns:cx6="http://schemas.microsoft.com/office/drawing/2016/5/12/chartex" xmlns:cx7="http://schemas.microsoft.com/office/drawing/2016/5/13/chartex" xmlns:cx8="http://schemas.microsoft.com/office/drawing/2016/5/14/chartex" xmlns:mc="http://schemas.openxmlformats.org/markup-compatibility/2006" xmlns:aink="http://schemas.microsoft.com/office/drawing/2016/ink" xmlns:am3d="http://schemas.microsoft.com/office/drawing/2017/model3d" xmlns:o="urn:schemas-microsoft-com:office:office" xmlns:oel="http://schemas.microsoft.com/office/2019/extlst" xmlns:r="http://schemas.openxmlformats.org/officeDocument/2006/relationships" xmlns:m="http://schemas.openxmlformats.org/officeDocument/2006/math" xmlns:v="urn:schemas-microsoft-com:vml" xmlns:wp14="http://schemas.microsoft.com/office/word/2010/wordprocessingDrawing" xmlns:wp="http://schemas.openxmlformats.org/drawingml/2006/wordprocessingDrawing" xmlns:w10="urn:schemas-microsoft-com:office:word" xmlns:w="http://schemas.openxmlformats.org/wordprocessingml/2006/main" xmlns:w14="http://schemas.microsoft.com/office/word/2010/wordml" xmlns:w15="http://schemas.microsoft.com/office/word/2012/wordml" xmlns:w16cex="http://schemas.microsoft.com/office/word/2018/wordml/cex" xmlns:w16cid="http://schemas.microsoft.com/office/word/2016/wordml/cid" xmlns:w16="http://schemas.microsoft.com/office/word/2018/wordml" xmlns:w16du="http://schemas.microsoft.com/office/word/2023/wordml/word16du" xmlns:w16sdtdh="http://schemas.microsoft.com/office/word/2020/wordml/sdtdatahash" xmlns:w16sdtfl="http://schemas.microsoft.com/office/word/2024/wordml/sdtformatlock" xmlns:w16se="http://schemas.microsoft.com/office/word/2015/wordml/symex" xmlns:wpg="http://schemas.microsoft.com/office/word/2010/wordprocessingGroup" xmlns:wpi="http://schemas.microsoft.com/office/word/2010/wordprocessingInk" xmlns:wne="http://schemas.microsoft.com/office/word/2006/wordml" xmlns:wps="http://schemas.microsoft.com/office/word/2010/wordprocessingShape" mc:Ignorable="w14 w15 w16se w16cid w16 w16cex w16sdtdh w16sdtfl w16du wp14">
+<w:document xmlns:wpc="http://schemas.microsoft.com/office/word/2010/wordprocessingCanvas" xmlns:cx="http://schemas.microsoft.com/office/drawing/2014/chartex" xmlns:cx1="http://schemas.microsoft.com/office/drawing/2015/9/8/chartex" xmlns:mc="http://schemas.openxmlformats.org/markup-compatibility/2006" xmlns:o="urn:schemas-microsoft-com:office:office" xmlns:r="http://schemas.openxmlformats.org/officeDocument/2006/relationships" xmlns:m="http://schemas.openxmlformats.org/officeDocument/2006/math" xmlns:v="urn:schemas-microsoft-com:vml" xmlns:wp14="http://schemas.microsoft.com/office/word/2010/wordprocessingDrawing" xmlns:wp="http://schemas.openxmlformats.org/drawingml/2006/wordprocessingDrawing" xmlns:w10="urn:schemas-microsoft-com:office:word" xmlns:w="http://schemas.openxmlformats.org/wordprocessingml/2006/main" xmlns:w14="http://schemas.microsoft.com/office/word/2010/wordml" xmlns:w15="http://schemas.microsoft.com/office/word/2012/wordml" xmlns:w16se="http://schemas.microsoft.com/office/word/2015/wordml/symex" xmlns:wpg="http://schemas.microsoft.com/office/word/2010/wordprocessingGroup" xmlns:wpi="http://schemas.microsoft.com/office/word/2010/wordprocessingInk" xmlns:wne="http://schemas.microsoft.com/office/word/2006/wordml" xmlns:wps="http://schemas.microsoft.com/office/word/2010/wordprocessingShape" mc:Ignorable="w14 w15 w16se wp14">
   <w:body>
     <w:p>
       <w:pPr>
@@ -146,7 +146,40 @@
         <w:t>mieux.</w:t>
       </w:r>
     </w:p>
-    <w:p/>
+    <w:p>
+      <w:pPr>
+        <w:rPr>
+          <w:b/>
+          <w:bCs/>
+          <w:color w:val="FF0000"/>
+        </w:rPr>
+      </w:pPr>
+    </w:p>
+    <w:p>
+      <w:pPr>
+        <w:rPr>
+          <w:color w:val="FF0000"/>
+        </w:rPr>
+      </w:pPr>
+      <w:r>
+        <w:rPr>
+          <w:color w:val="FF0000"/>
+        </w:rPr>
+        <w:t>Remarque : tous les paragraphes surlignés en jaune correspondent à des fonctionnalités qui ne sont pas encore prises en compte</w:t>
+      </w:r>
+      <w:r>
+        <w:rPr>
+          <w:color w:val="FF0000"/>
+        </w:rPr>
+        <w:t xml:space="preserve"> </w:t>
+      </w:r>
+      <w:r>
+        <w:rPr>
+          <w:color w:val="FF0000"/>
+        </w:rPr>
+        <w:t>pour le moment.</w:t>
+      </w:r>
+    </w:p>
     <w:p>
       <w:pPr>
         <w:rPr>
@@ -172,7 +205,7 @@
     </w:p>
     <w:p>
       <w:pPr>
-        <w:pStyle w:val="Paragraphedeliste"/>
+        <w:pStyle w:val="ListParagraph"/>
         <w:numPr>
           <w:ilvl w:val="1"/>
           <w:numId w:val="2"/>
@@ -205,7 +238,7 @@
     </w:p>
     <w:p>
       <w:pPr>
-        <w:pStyle w:val="Paragraphedeliste"/>
+        <w:pStyle w:val="ListParagraph"/>
         <w:ind w:left="380"/>
         <w:rPr>
           <w:b/>
@@ -217,7 +250,7 @@
     </w:p>
     <w:p>
       <w:pPr>
-        <w:pStyle w:val="Paragraphedeliste"/>
+        <w:pStyle w:val="ListParagraph"/>
         <w:numPr>
           <w:ilvl w:val="0"/>
           <w:numId w:val="6"/>
@@ -229,12 +262,12 @@
     </w:p>
     <w:p>
       <w:pPr>
-        <w:pStyle w:val="Paragraphedeliste"/>
-      </w:pPr>
-    </w:p>
-    <w:p>
-      <w:pPr>
-        <w:pStyle w:val="Paragraphedeliste"/>
+        <w:pStyle w:val="ListParagraph"/>
+      </w:pPr>
+    </w:p>
+    <w:p>
+      <w:pPr>
+        <w:pStyle w:val="ListParagraph"/>
         <w:numPr>
           <w:ilvl w:val="0"/>
           <w:numId w:val="6"/>
@@ -249,7 +282,10 @@
       </w:r>
       <w:proofErr w:type="spellEnd"/>
       <w:r>
-        <w:t xml:space="preserve"> ) avec le minimum d’information pour faciliter le reste de process </w:t>
+        <w:t>)</w:t>
+      </w:r>
+      <w:r>
+        <w:t xml:space="preserve"> avec le minimum d’information pour faciliter le reste de process </w:t>
       </w:r>
       <w:r>
         <w:t xml:space="preserve">que </w:t>
@@ -260,12 +296,12 @@
     </w:p>
     <w:p>
       <w:pPr>
-        <w:pStyle w:val="Paragraphedeliste"/>
-      </w:pPr>
-    </w:p>
-    <w:p>
-      <w:pPr>
-        <w:pStyle w:val="Paragraphedeliste"/>
+        <w:pStyle w:val="ListParagraph"/>
+      </w:pPr>
+    </w:p>
+    <w:p>
+      <w:pPr>
+        <w:pStyle w:val="ListParagraph"/>
         <w:numPr>
           <w:ilvl w:val="0"/>
           <w:numId w:val="6"/>
@@ -322,13 +358,13 @@
     </w:p>
     <w:p>
       <w:pPr>
-        <w:pStyle w:val="Paragraphedeliste"/>
+        <w:pStyle w:val="ListParagraph"/>
         <w:ind w:left="380"/>
       </w:pPr>
     </w:p>
     <w:p>
       <w:pPr>
-        <w:pStyle w:val="Paragraphedeliste"/>
+        <w:pStyle w:val="ListParagraph"/>
         <w:numPr>
           <w:ilvl w:val="1"/>
           <w:numId w:val="2"/>
@@ -350,7 +386,7 @@
     </w:p>
     <w:p>
       <w:pPr>
-        <w:pStyle w:val="Paragraphedeliste"/>
+        <w:pStyle w:val="ListParagraph"/>
         <w:numPr>
           <w:ilvl w:val="0"/>
           <w:numId w:val="6"/>
@@ -365,7 +401,7 @@
     </w:p>
     <w:p>
       <w:pPr>
-        <w:pStyle w:val="Paragraphedeliste"/>
+        <w:pStyle w:val="ListParagraph"/>
         <w:numPr>
           <w:ilvl w:val="0"/>
           <w:numId w:val="7"/>
@@ -410,7 +446,7 @@
     </w:p>
     <w:p>
       <w:pPr>
-        <w:pStyle w:val="Paragraphedeliste"/>
+        <w:pStyle w:val="ListParagraph"/>
         <w:ind w:left="1100"/>
       </w:pPr>
       <w:r>
@@ -439,7 +475,7 @@
     </w:p>
     <w:p>
       <w:pPr>
-        <w:pStyle w:val="Paragraphedeliste"/>
+        <w:pStyle w:val="ListParagraph"/>
         <w:ind w:left="1100"/>
       </w:pPr>
       <w:r>
@@ -478,19 +514,18 @@
     </w:p>
     <w:p>
       <w:pPr>
-        <w:pStyle w:val="Paragraphedeliste"/>
+        <w:pStyle w:val="ListParagraph"/>
         <w:ind w:left="1100"/>
       </w:pPr>
     </w:p>
     <w:p>
       <w:pPr>
-        <w:pStyle w:val="Paragraphedeliste"/>
+        <w:pStyle w:val="ListParagraph"/>
         <w:numPr>
           <w:ilvl w:val="0"/>
           <w:numId w:val="7"/>
         </w:numPr>
         <w:rPr>
-          <w:rFonts w:hint="cs"/>
           <w:rtl/>
         </w:rPr>
       </w:pPr>
@@ -512,7 +547,7 @@
     </w:p>
     <w:p>
       <w:pPr>
-        <w:pStyle w:val="Paragraphedeliste"/>
+        <w:pStyle w:val="ListParagraph"/>
         <w:numPr>
           <w:ilvl w:val="1"/>
           <w:numId w:val="2"/>
@@ -536,7 +571,7 @@
     </w:p>
     <w:p>
       <w:pPr>
-        <w:pStyle w:val="Paragraphedeliste"/>
+        <w:pStyle w:val="ListParagraph"/>
         <w:ind w:left="380"/>
         <w:rPr>
           <w:b/>
@@ -548,7 +583,7 @@
     </w:p>
     <w:p>
       <w:pPr>
-        <w:pStyle w:val="Paragraphedeliste"/>
+        <w:pStyle w:val="ListParagraph"/>
         <w:numPr>
           <w:ilvl w:val="0"/>
           <w:numId w:val="5"/>
@@ -569,7 +604,7 @@
     </w:p>
     <w:p>
       <w:pPr>
-        <w:pStyle w:val="Paragraphedeliste"/>
+        <w:pStyle w:val="ListParagraph"/>
         <w:numPr>
           <w:ilvl w:val="0"/>
           <w:numId w:val="8"/>
@@ -590,7 +625,7 @@
     </w:p>
     <w:p>
       <w:pPr>
-        <w:pStyle w:val="Paragraphedeliste"/>
+        <w:pStyle w:val="ListParagraph"/>
         <w:numPr>
           <w:ilvl w:val="0"/>
           <w:numId w:val="11"/>
@@ -608,7 +643,7 @@
     </w:p>
     <w:p>
       <w:pPr>
-        <w:pStyle w:val="Paragraphedeliste"/>
+        <w:pStyle w:val="ListParagraph"/>
         <w:numPr>
           <w:ilvl w:val="0"/>
           <w:numId w:val="11"/>
@@ -629,58 +664,58 @@
     </w:p>
     <w:p>
       <w:pPr>
-        <w:pStyle w:val="Paragraphedeliste"/>
+        <w:pStyle w:val="ListParagraph"/>
         <w:ind w:left="740"/>
       </w:pPr>
     </w:p>
     <w:p>
       <w:pPr>
-        <w:pStyle w:val="Paragraphedeliste"/>
+        <w:pStyle w:val="ListParagraph"/>
         <w:numPr>
           <w:ilvl w:val="0"/>
           <w:numId w:val="8"/>
         </w:numPr>
       </w:pPr>
       <w:r>
-        <w:t>Les</w:t>
-      </w:r>
-      <w:r>
-        <w:t xml:space="preserve"> demandes</w:t>
-      </w:r>
-      <w:r>
-        <w:t xml:space="preserve"> de rendez-vous avec le motif</w:t>
-      </w:r>
-      <w:r>
-        <w:t> :</w:t>
-      </w:r>
-    </w:p>
-    <w:p>
-      <w:pPr>
-        <w:pStyle w:val="Paragraphedeliste"/>
+        <w:t>Les demandes</w:t>
+      </w:r>
+      <w:r>
+        <w:t xml:space="preserve"> de rendez-vous avec le motif :</w:t>
+      </w:r>
+    </w:p>
+    <w:p>
+      <w:pPr>
+        <w:pStyle w:val="ListParagraph"/>
         <w:numPr>
           <w:ilvl w:val="0"/>
           <w:numId w:val="12"/>
         </w:numPr>
       </w:pPr>
       <w:r>
-        <w:t>Dès réception de la demande, les gestionnaires des services auront la possibilité de la valider en lui attribuant un créneau, ou de la rejeter.</w:t>
-      </w:r>
-    </w:p>
-    <w:p>
-      <w:pPr>
-        <w:pStyle w:val="Paragraphedeliste"/>
+        <w:t>Dès réception de la demande, les gestionnaires des services auront la possibilité de la valider en lui attribuant un créneau</w:t>
+      </w:r>
+      <w:r>
+        <w:t xml:space="preserve"> selon la disponibilité</w:t>
+      </w:r>
+      <w:r>
+        <w:t>, ou de la rejeter.</w:t>
+      </w:r>
+    </w:p>
+    <w:p>
+      <w:pPr>
+        <w:pStyle w:val="ListParagraph"/>
         <w:ind w:left="1100"/>
       </w:pPr>
     </w:p>
     <w:p>
       <w:pPr>
-        <w:pStyle w:val="Paragraphedeliste"/>
+        <w:pStyle w:val="ListParagraph"/>
         <w:ind w:left="740"/>
       </w:pPr>
     </w:p>
     <w:p>
       <w:pPr>
-        <w:pStyle w:val="Paragraphedeliste"/>
+        <w:pStyle w:val="ListParagraph"/>
         <w:numPr>
           <w:ilvl w:val="0"/>
           <w:numId w:val="4"/>
@@ -690,18 +725,70 @@
         <w:t>Possibilité de création de RDV depuis l’interface manager pour un client donné (dans le cas où le client contact la société pour un demander un RDV)</w:t>
       </w:r>
       <w:r>
-        <w:t>.</w:t>
-      </w:r>
-    </w:p>
-    <w:p>
-      <w:pPr>
-        <w:pStyle w:val="Paragraphedeliste"/>
+        <w:t> :</w:t>
+      </w:r>
+    </w:p>
+    <w:p>
+      <w:pPr>
+        <w:pStyle w:val="ListParagraph"/>
+        <w:numPr>
+          <w:ilvl w:val="0"/>
+          <w:numId w:val="12"/>
+        </w:numPr>
+        <w:rPr>
+          <w:highlight w:val="yellow"/>
+        </w:rPr>
+      </w:pPr>
+      <w:r>
+        <w:rPr>
+          <w:highlight w:val="yellow"/>
+        </w:rPr>
+        <w:t xml:space="preserve">Dans cette partie une recherche par </w:t>
+      </w:r>
+      <w:r>
+        <w:rPr>
+          <w:b/>
+          <w:bCs/>
+          <w:highlight w:val="yellow"/>
+        </w:rPr>
+        <w:t>référence client</w:t>
+      </w:r>
+      <w:r>
+        <w:rPr>
+          <w:b/>
+          <w:bCs/>
+          <w:highlight w:val="yellow"/>
+        </w:rPr>
+        <w:t xml:space="preserve">, par numéro téléphone ou par email </w:t>
+      </w:r>
+      <w:r>
+        <w:rPr>
+          <w:highlight w:val="yellow"/>
+        </w:rPr>
+        <w:t>sera</w:t>
+      </w:r>
+      <w:r>
+        <w:rPr>
+          <w:highlight w:val="yellow"/>
+        </w:rPr>
+        <w:t xml:space="preserve"> disponible lors de la création d’un Rdv via l’interface manager avec la possibilité</w:t>
+      </w:r>
+      <w:r>
+        <w:rPr>
+          <w:highlight w:val="yellow"/>
+        </w:rPr>
+        <w:t xml:space="preserve"> de création des nouveaux clients.</w:t>
+      </w:r>
+    </w:p>
+    <w:p>
+      <w:pPr>
+        <w:pStyle w:val="ListParagraph"/>
         <w:ind w:left="740"/>
       </w:pPr>
     </w:p>
     <w:p>
       <w:pPr>
-        <w:pStyle w:val="Paragraphedeliste"/>
+        <w:pStyle w:val="ListParagraph"/>
         <w:numPr>
           <w:ilvl w:val="0"/>
           <w:numId w:val="4"/>
@@ -711,8 +798,13 @@
         <w:t xml:space="preserve">Consultation de </w:t>
       </w:r>
       <w:r>
-        <w:t>tous les rdvs</w:t>
-      </w:r>
+        <w:t xml:space="preserve">tous les </w:t>
+      </w:r>
+      <w:proofErr w:type="spellStart"/>
+      <w:r>
+        <w:t>rdvs</w:t>
+      </w:r>
+      <w:proofErr w:type="spellEnd"/>
       <w:r>
         <w:t xml:space="preserve"> </w:t>
       </w:r>
@@ -720,16 +812,16 @@
         <w:t>dans</w:t>
       </w:r>
       <w:r>
-        <w:t xml:space="preserve"> un calendrier </w:t>
-      </w:r>
-      <w:r>
-        <w:t xml:space="preserve">avec la possibilité de faire des actions pour chaque rdv (la possibilité d’afficher </w:t>
-      </w:r>
-      <w:r>
-        <w:t>les rdvs</w:t>
-      </w:r>
-      <w:r>
-        <w:t xml:space="preserve"> dans une liste avec un moteur de filtre puissant)</w:t>
+        <w:t xml:space="preserve"> un calendrier</w:t>
+      </w:r>
+      <w:r>
+        <w:t xml:space="preserve"> ou une liste</w:t>
+      </w:r>
+      <w:r>
+        <w:t xml:space="preserve"> </w:t>
+      </w:r>
+      <w:r>
+        <w:t>avec la possibilité de faire des actions pour chaque rdv</w:t>
       </w:r>
       <w:r>
         <w:t>.</w:t>
@@ -737,7 +829,43 @@
     </w:p>
     <w:p>
       <w:pPr>
-        <w:pStyle w:val="Paragraphedeliste"/>
+        <w:pStyle w:val="ListParagraph"/>
+        <w:numPr>
+          <w:ilvl w:val="1"/>
+          <w:numId w:val="4"/>
+        </w:numPr>
+        <w:rPr>
+          <w:highlight w:val="yellow"/>
+        </w:rPr>
+      </w:pPr>
+      <w:r>
+        <w:rPr>
+          <w:highlight w:val="yellow"/>
+        </w:rPr>
+        <w:t xml:space="preserve">Un filtre puissant sera disponible pour cette </w:t>
+      </w:r>
+      <w:r>
+        <w:rPr>
+          <w:highlight w:val="yellow"/>
+        </w:rPr>
+        <w:t>partie (filtre par date / par motif/ par client</w:t>
+      </w:r>
+      <w:r>
+        <w:rPr>
+          <w:highlight w:val="yellow"/>
+        </w:rPr>
+        <w:t>…</w:t>
+      </w:r>
+      <w:r>
+        <w:rPr>
+          <w:highlight w:val="yellow"/>
+        </w:rPr>
+        <w:t>)</w:t>
+      </w:r>
+    </w:p>
+    <w:p>
+      <w:pPr>
+        <w:pStyle w:val="ListParagraph"/>
         <w:ind w:left="380"/>
       </w:pPr>
       <w:r>
@@ -751,12 +879,19 @@
         <w:rPr>
           <w:highlight w:val="yellow"/>
         </w:rPr>
-        <w:t xml:space="preserve">Configuration personnalisée de la façon dont les clients pourraient prendre un rdv (par </w:t>
+        <w:t xml:space="preserve">Configuration personnalisée de la façon dont les clients pourraient prendre un </w:t>
       </w:r>
       <w:r>
         <w:rPr>
           <w:highlight w:val="yellow"/>
         </w:rPr>
+        <w:lastRenderedPageBreak/>
+        <w:t xml:space="preserve">rdv (par </w:t>
+      </w:r>
+      <w:r>
+        <w:rPr>
+          <w:highlight w:val="yellow"/>
+        </w:rPr>
         <w:t>exemple :</w:t>
       </w:r>
       <w:r>
@@ -794,7 +929,7 @@
     </w:p>
     <w:p>
       <w:pPr>
-        <w:pStyle w:val="Paragraphedeliste"/>
+        <w:pStyle w:val="ListParagraph"/>
         <w:ind w:left="380"/>
       </w:pPr>
       <w:r>
@@ -805,61 +940,108 @@
         <w:tab/>
       </w:r>
       <w:r>
+        <w:rPr>
+          <w:shd w:val="clear" w:color="auto" w:fill="FFFF00"/>
+        </w:rPr>
         <w:t xml:space="preserve">La possibilité </w:t>
       </w:r>
       <w:r>
+        <w:rPr>
+          <w:shd w:val="clear" w:color="auto" w:fill="FFFF00"/>
+        </w:rPr>
         <w:t>de</w:t>
       </w:r>
       <w:r>
+        <w:rPr>
+          <w:shd w:val="clear" w:color="auto" w:fill="FFFF00"/>
+        </w:rPr>
         <w:t xml:space="preserve"> générer des créneau</w:t>
       </w:r>
       <w:r>
+        <w:rPr>
+          <w:shd w:val="clear" w:color="auto" w:fill="FFFF00"/>
+        </w:rPr>
         <w:t>x</w:t>
       </w:r>
       <w:r>
+        <w:rPr>
+          <w:shd w:val="clear" w:color="auto" w:fill="FFFF00"/>
+        </w:rPr>
         <w:t xml:space="preserve"> dans un intervalle de </w:t>
       </w:r>
       <w:r>
+        <w:rPr>
+          <w:shd w:val="clear" w:color="auto" w:fill="FFFF00"/>
+        </w:rPr>
         <w:t>temps (</w:t>
       </w:r>
       <w:r>
+        <w:rPr>
+          <w:shd w:val="clear" w:color="auto" w:fill="FFFF00"/>
+        </w:rPr>
         <w:t xml:space="preserve">par exemple de 1 Aout jusqu’à 30 </w:t>
       </w:r>
       <w:r>
+        <w:rPr>
+          <w:shd w:val="clear" w:color="auto" w:fill="FFFF00"/>
+        </w:rPr>
         <w:t>novembre</w:t>
       </w:r>
       <w:r>
+        <w:rPr>
+          <w:shd w:val="clear" w:color="auto" w:fill="FFFF00"/>
+        </w:rPr>
         <w:t>) avec la définition de</w:t>
       </w:r>
       <w:r>
+        <w:rPr>
+          <w:shd w:val="clear" w:color="auto" w:fill="FFFF00"/>
+        </w:rPr>
         <w:t>s</w:t>
       </w:r>
       <w:r>
+        <w:rPr>
+          <w:shd w:val="clear" w:color="auto" w:fill="FFFF00"/>
+        </w:rPr>
         <w:t xml:space="preserve"> jours de repos </w:t>
       </w:r>
       <w:r>
+        <w:rPr>
+          <w:shd w:val="clear" w:color="auto" w:fill="FFFF00"/>
+        </w:rPr>
         <w:t>q</w:t>
       </w:r>
       <w:r>
+        <w:rPr>
+          <w:shd w:val="clear" w:color="auto" w:fill="FFFF00"/>
+        </w:rPr>
         <w:t>ui va se répéter pour tout</w:t>
       </w:r>
       <w:r>
+        <w:rPr>
+          <w:shd w:val="clear" w:color="auto" w:fill="FFFF00"/>
+        </w:rPr>
         <w:t>es</w:t>
       </w:r>
       <w:r>
+        <w:rPr>
+          <w:shd w:val="clear" w:color="auto" w:fill="FFFF00"/>
+        </w:rPr>
         <w:t xml:space="preserve"> les semaines</w:t>
       </w:r>
       <w:r>
+        <w:rPr>
+          <w:shd w:val="clear" w:color="auto" w:fill="FFFF00"/>
+        </w:rPr>
         <w:t xml:space="preserve"> de cet intervalle.</w:t>
       </w:r>
     </w:p>
     <w:p>
       <w:pPr>
-        <w:pStyle w:val="Paragraphedeliste"/>
+        <w:pStyle w:val="ListParagraph"/>
         <w:ind w:left="380"/>
       </w:pPr>
       <w:r>
-        <w:lastRenderedPageBreak/>
         <w:br/>
       </w:r>
       <w:r>
@@ -895,7 +1077,7 @@
     </w:p>
     <w:p>
       <w:pPr>
-        <w:pStyle w:val="Paragraphedeliste"/>
+        <w:pStyle w:val="ListParagraph"/>
         <w:ind w:left="380"/>
       </w:pPr>
       <w:r>
@@ -912,12 +1094,71 @@
         <w:t>des créneaux disponibles</w:t>
       </w:r>
       <w:r>
-        <w:t xml:space="preserve"> selon les configurations faites par la société (intervalle de date pour les disponibilités, durée de rdv, exclusion des jours fériés, exclusion des dates prédéfinis par la société) </w:t>
-      </w:r>
-    </w:p>
-    <w:p>
-      <w:pPr>
-        <w:pStyle w:val="Paragraphedeliste"/>
+        <w:t xml:space="preserve"> selon les configurations faites par la société (intervalle de date pour les disponibilités, durée de rdv, exclusion des jours fériés, exclusion des dates prédéfinis par la société</w:t>
+      </w:r>
+      <w:proofErr w:type="gramStart"/>
+      <w:r>
+        <w:t xml:space="preserve">) </w:t>
+      </w:r>
+      <w:r>
+        <w:t>.</w:t>
+      </w:r>
+      <w:proofErr w:type="gramEnd"/>
+    </w:p>
+    <w:p>
+      <w:pPr>
+        <w:pStyle w:val="ListParagraph"/>
+        <w:ind w:left="380"/>
+      </w:pPr>
+      <w:r>
+        <w:br/>
+      </w:r>
+      <w:r>
+        <w:rPr>
+          <w:shd w:val="clear" w:color="auto" w:fill="FFFF00"/>
+        </w:rPr>
+        <w:t>-</w:t>
+      </w:r>
+      <w:r>
+        <w:rPr>
+          <w:shd w:val="clear" w:color="auto" w:fill="FFFF00"/>
+        </w:rPr>
+        <w:tab/>
+      </w:r>
+      <w:r>
+        <w:rPr>
+          <w:shd w:val="clear" w:color="auto" w:fill="FFFF00"/>
+        </w:rPr>
+        <w:t xml:space="preserve">Fermeture exceptionnelle dans le cas </w:t>
+      </w:r>
+      <w:r>
+        <w:rPr>
+          <w:shd w:val="clear" w:color="auto" w:fill="FFFF00"/>
+        </w:rPr>
+        <w:t>où</w:t>
+      </w:r>
+      <w:r>
+        <w:rPr>
+          <w:shd w:val="clear" w:color="auto" w:fill="FFFF00"/>
+        </w:rPr>
+        <w:t xml:space="preserve"> on à générer des créneaux </w:t>
+      </w:r>
+      <w:r>
+        <w:rPr>
+          <w:shd w:val="clear" w:color="auto" w:fill="FFFF00"/>
+        </w:rPr>
+        <w:t>cependant</w:t>
+      </w:r>
+      <w:r>
+        <w:rPr>
+          <w:shd w:val="clear" w:color="auto" w:fill="FFFF00"/>
+        </w:rPr>
+        <w:t xml:space="preserve"> on a eu des imprévus qui causent la fermeture.</w:t>
+      </w:r>
+    </w:p>
+    <w:p>
+      <w:pPr>
+        <w:pStyle w:val="ListParagraph"/>
         <w:ind w:left="380"/>
       </w:pPr>
       <w:r>
@@ -928,128 +1169,230 @@
         <w:tab/>
       </w:r>
       <w:r>
-        <w:t xml:space="preserve">Fermeture exceptionnelle dans le cas </w:t>
-      </w:r>
-      <w:r>
-        <w:t>où</w:t>
-      </w:r>
-      <w:r>
-        <w:t xml:space="preserve"> on à générer des créneaux </w:t>
-      </w:r>
-      <w:r>
-        <w:t>cependant</w:t>
-      </w:r>
-      <w:r>
-        <w:t xml:space="preserve"> on a eu des imprévus qui causent la fermeture.</w:t>
-      </w:r>
-    </w:p>
-    <w:p>
-      <w:pPr>
-        <w:pStyle w:val="Paragraphedeliste"/>
+        <w:t xml:space="preserve">Donner la main aux sociétés pour créer la liste des prestations des rdv pour chaque </w:t>
+      </w:r>
+      <w:r>
+        <w:t>service (</w:t>
+      </w:r>
+      <w:r>
+        <w:t xml:space="preserve">motif de rdv </w:t>
+      </w:r>
+      <w:r>
+        <w:t>ex :</w:t>
+      </w:r>
+      <w:r>
+        <w:t xml:space="preserve"> consultation, changement de </w:t>
+      </w:r>
+      <w:proofErr w:type="gramStart"/>
+      <w:r>
+        <w:t>pneu</w:t>
+      </w:r>
+      <w:r>
+        <w:t xml:space="preserve"> ,</w:t>
+      </w:r>
+      <w:proofErr w:type="gramEnd"/>
+      <w:r>
+        <w:t xml:space="preserve"> </w:t>
+      </w:r>
+      <w:r>
+        <w:t>contrôle</w:t>
+      </w:r>
+      <w:r>
+        <w:t xml:space="preserve"> technique , ..</w:t>
+      </w:r>
+      <w:r>
+        <w:t>etc.</w:t>
+      </w:r>
+      <w:r>
+        <w:t>)</w:t>
+      </w:r>
+    </w:p>
+    <w:p>
+      <w:pPr>
+        <w:pStyle w:val="ListParagraph"/>
+        <w:numPr>
+          <w:ilvl w:val="0"/>
+          <w:numId w:val="4"/>
+        </w:numPr>
+      </w:pPr>
+      <w:r>
+        <w:rPr>
+          <w:highlight w:val="yellow"/>
+        </w:rPr>
+        <w:t xml:space="preserve">Pour un créneau il faut ajouter la possibilité de définir le nombre de dispo pour le créneau </w:t>
+      </w:r>
+      <w:r>
+        <w:rPr>
+          <w:highlight w:val="yellow"/>
+        </w:rPr>
+        <w:t>lui-même</w:t>
+      </w:r>
+      <w:r>
+        <w:rPr>
+          <w:highlight w:val="yellow"/>
+        </w:rPr>
+        <w:t xml:space="preserve"> </w:t>
+      </w:r>
+      <w:proofErr w:type="gramStart"/>
+      <w:r>
+        <w:rPr>
+          <w:highlight w:val="yellow"/>
+        </w:rPr>
+        <w:t>( ex</w:t>
+      </w:r>
+      <w:proofErr w:type="gramEnd"/>
+      <w:r>
+        <w:rPr>
+          <w:highlight w:val="yellow"/>
+        </w:rPr>
+        <w:t xml:space="preserve">: un atelier de 3 personnes pour le créneau de 8h15 ce </w:t>
+      </w:r>
+      <w:r>
+        <w:rPr>
+          <w:highlight w:val="yellow"/>
+        </w:rPr>
+        <w:t>n’est</w:t>
+      </w:r>
+      <w:r>
+        <w:rPr>
+          <w:highlight w:val="yellow"/>
+        </w:rPr>
+        <w:t xml:space="preserve"> pas logique de prendre 1e fois or que tu as de la dispo pour les autres employés.. </w:t>
+      </w:r>
+      <w:r>
+        <w:rPr>
+          <w:highlight w:val="yellow"/>
+        </w:rPr>
+        <w:t>À</w:t>
+      </w:r>
+      <w:r>
+        <w:rPr>
+          <w:highlight w:val="yellow"/>
+        </w:rPr>
+        <w:t xml:space="preserve"> voir)</w:t>
+      </w:r>
+      <w:r>
+        <w:t>.</w:t>
+      </w:r>
+    </w:p>
+    <w:p>
+      <w:pPr>
+        <w:pStyle w:val="ListParagraph"/>
+        <w:ind w:left="740"/>
+      </w:pPr>
+    </w:p>
+    <w:p>
+      <w:pPr>
+        <w:pStyle w:val="ListParagraph"/>
+        <w:numPr>
+          <w:ilvl w:val="0"/>
+          <w:numId w:val="4"/>
+        </w:numPr>
+      </w:pPr>
+      <w:r>
+        <w:rPr>
+          <w:highlight w:val="yellow"/>
+        </w:rPr>
+        <w:t>L’e</w:t>
+      </w:r>
+      <w:r>
+        <w:rPr>
+          <w:highlight w:val="yellow"/>
+        </w:rPr>
+        <w:t>nvoie</w:t>
+      </w:r>
+      <w:r>
+        <w:rPr>
+          <w:highlight w:val="yellow"/>
+        </w:rPr>
+        <w:t xml:space="preserve"> des notification</w:t>
+      </w:r>
+      <w:r>
+        <w:rPr>
+          <w:highlight w:val="yellow"/>
+        </w:rPr>
+        <w:t>s</w:t>
+      </w:r>
+      <w:r>
+        <w:rPr>
+          <w:highlight w:val="yellow"/>
+        </w:rPr>
+        <w:t xml:space="preserve"> de rappel un jour avant le rdv</w:t>
+      </w:r>
+      <w:r>
+        <w:rPr>
+          <w:highlight w:val="yellow"/>
+        </w:rPr>
+        <w:t>.</w:t>
+      </w:r>
+    </w:p>
+    <w:p>
+      <w:pPr>
+        <w:pStyle w:val="ListParagraph"/>
+        <w:rPr>
+          <w:highlight w:val="yellow"/>
+        </w:rPr>
+      </w:pPr>
+    </w:p>
+    <w:p>
+      <w:pPr>
+        <w:pStyle w:val="ListParagraph"/>
+        <w:numPr>
+          <w:ilvl w:val="0"/>
+          <w:numId w:val="4"/>
+        </w:numPr>
+      </w:pPr>
+      <w:r>
+        <w:rPr>
+          <w:highlight w:val="yellow"/>
+        </w:rPr>
+        <w:t>L’e</w:t>
+      </w:r>
+      <w:r>
+        <w:rPr>
+          <w:highlight w:val="yellow"/>
+        </w:rPr>
+        <w:t xml:space="preserve">nvoie des emails de confirmation lors de la création </w:t>
+      </w:r>
+      <w:r>
+        <w:rPr>
+          <w:highlight w:val="yellow"/>
+        </w:rPr>
+        <w:t xml:space="preserve">/ annulation ou modification </w:t>
+      </w:r>
+      <w:r>
+        <w:rPr>
+          <w:highlight w:val="yellow"/>
+        </w:rPr>
+        <w:t xml:space="preserve">des </w:t>
+      </w:r>
+      <w:proofErr w:type="spellStart"/>
+      <w:r>
+        <w:rPr>
+          <w:highlight w:val="yellow"/>
+        </w:rPr>
+        <w:t>RDVs</w:t>
+      </w:r>
+      <w:proofErr w:type="spellEnd"/>
+      <w:r>
+        <w:t>.</w:t>
+      </w:r>
+    </w:p>
+    <w:p>
+      <w:pPr>
+        <w:pStyle w:val="ListParagraph"/>
         <w:ind w:left="380"/>
       </w:pPr>
-      <w:r>
-        <w:br/>
-        <w:t>-</w:t>
-      </w:r>
-      <w:r>
-        <w:tab/>
-      </w:r>
-      <w:r>
-        <w:t xml:space="preserve">Donner la main aux sociétés pour créer la liste des prestations des rdv pour chaque </w:t>
-      </w:r>
-      <w:r>
-        <w:t>service (</w:t>
-      </w:r>
-      <w:r>
-        <w:t xml:space="preserve">motif de rdv </w:t>
-      </w:r>
-      <w:r>
-        <w:t>ex :</w:t>
-      </w:r>
-      <w:r>
-        <w:t xml:space="preserve"> consultation, changement de </w:t>
-      </w:r>
-      <w:r>
-        <w:t>pneu</w:t>
-      </w:r>
-      <w:r>
-        <w:t xml:space="preserve"> , </w:t>
-      </w:r>
-      <w:r>
-        <w:t>contrôle</w:t>
-      </w:r>
-      <w:r>
-        <w:t xml:space="preserve"> technique , ..</w:t>
-      </w:r>
-      <w:r>
-        <w:t>etc.</w:t>
-      </w:r>
-      <w:r>
-        <w:t>)</w:t>
-      </w:r>
-      <w:r>
-        <w:br/>
-        <w:t>-</w:t>
-      </w:r>
-      <w:r>
-        <w:tab/>
-      </w:r>
-      <w:r>
-        <w:t xml:space="preserve">Pour un créneau il faut ajouter la possibilité de définir le nombre de dispo pour le créneau </w:t>
-      </w:r>
-      <w:r>
-        <w:t>lui-même</w:t>
-      </w:r>
-      <w:r>
-        <w:t xml:space="preserve"> </w:t>
-      </w:r>
-      <w:r>
-        <w:t xml:space="preserve">( ex: un atelier de 3 personnes pour le créneau de 8h15 ce </w:t>
-      </w:r>
-      <w:r>
-        <w:t>n’est</w:t>
-      </w:r>
-      <w:r>
-        <w:t xml:space="preserve"> pas logique de prendre 1e fois or que tu as de la dispo pour les autres employés.. </w:t>
-      </w:r>
-      <w:r>
-        <w:t>à</w:t>
-      </w:r>
-      <w:r>
-        <w:t xml:space="preserve"> voir)</w:t>
-      </w:r>
-      <w:r>
-        <w:rPr>
-          <w:color w:val="FF0000"/>
-        </w:rPr>
-        <w:br/>
-      </w:r>
-      <w:r>
-        <w:t>-</w:t>
-      </w:r>
-      <w:r>
-        <w:tab/>
-      </w:r>
-      <w:r>
-        <w:t>envoie des notification</w:t>
-      </w:r>
-      <w:r>
-        <w:t>s</w:t>
-      </w:r>
-      <w:r>
-        <w:t xml:space="preserve"> de rappel un jour avant le rdv</w:t>
-      </w:r>
-    </w:p>
-    <w:p>
-      <w:pPr>
-        <w:pStyle w:val="Paragraphedeliste"/>
+    </w:p>
+    <w:p>
+      <w:pPr>
+        <w:pStyle w:val="ListParagraph"/>
         <w:ind w:left="380"/>
       </w:pPr>
     </w:p>
     <w:p>
       <w:pPr>
-        <w:pStyle w:val="Paragraphedeliste"/>
+        <w:pStyle w:val="ListParagraph"/>
         <w:numPr>
           <w:ilvl w:val="1"/>
           <w:numId w:val="2"/>
@@ -1073,7 +1416,7 @@
     </w:p>
     <w:p>
       <w:pPr>
-        <w:pStyle w:val="Paragraphedeliste"/>
+        <w:pStyle w:val="ListParagraph"/>
         <w:ind w:left="380"/>
       </w:pPr>
       <w:r>
@@ -1091,7 +1434,7 @@
     </w:p>
     <w:p>
       <w:pPr>
-        <w:pStyle w:val="Paragraphedeliste"/>
+        <w:pStyle w:val="ListParagraph"/>
         <w:ind w:left="380"/>
       </w:pPr>
       <w:r>
@@ -1106,31 +1449,61 @@
     </w:p>
     <w:p>
       <w:pPr>
-        <w:pStyle w:val="Paragraphedeliste"/>
+        <w:pStyle w:val="ListParagraph"/>
         <w:ind w:left="380"/>
       </w:pPr>
     </w:p>
     <w:p>
       <w:pPr>
-        <w:pStyle w:val="Paragraphedeliste"/>
+        <w:pStyle w:val="ListParagraph"/>
         <w:ind w:left="380"/>
       </w:pPr>
     </w:p>
     <w:p>
       <w:pPr>
-        <w:pStyle w:val="Paragraphedeliste"/>
+        <w:pStyle w:val="ListParagraph"/>
         <w:ind w:left="380"/>
       </w:pPr>
     </w:p>
     <w:p>
       <w:pPr>
-        <w:pStyle w:val="Paragraphedeliste"/>
+        <w:pStyle w:val="ListParagraph"/>
         <w:ind w:left="380"/>
       </w:pPr>
     </w:p>
     <w:p>
       <w:pPr>
-        <w:pStyle w:val="Paragraphedeliste"/>
+        <w:pStyle w:val="ListParagraph"/>
+        <w:ind w:left="380"/>
+      </w:pPr>
+    </w:p>
+    <w:p>
+      <w:pPr>
+        <w:pStyle w:val="ListParagraph"/>
+        <w:ind w:left="380"/>
+      </w:pPr>
+    </w:p>
+    <w:p>
+      <w:pPr>
+        <w:pStyle w:val="ListParagraph"/>
+        <w:ind w:left="380"/>
+      </w:pPr>
+    </w:p>
+    <w:p>
+      <w:pPr>
+        <w:pStyle w:val="ListParagraph"/>
+        <w:ind w:left="380"/>
+      </w:pPr>
+    </w:p>
+    <w:p>
+      <w:pPr>
+        <w:pStyle w:val="ListParagraph"/>
+        <w:ind w:left="380"/>
+      </w:pPr>
+    </w:p>
+    <w:p>
+      <w:pPr>
+        <w:pStyle w:val="ListParagraph"/>
         <w:ind w:left="380"/>
       </w:pPr>
     </w:p>
@@ -1246,13 +1619,10 @@
         <w:tab/>
       </w:r>
       <w:r>
-        <w:t xml:space="preserve">La recherche intelligente (nous mettrons au dispositif de l’utilisateur un outil puissant qui permet d’extraire des informations pertinentes sur le rdv lequel l’utilisateur </w:t>
-      </w:r>
-      <w:r>
-        <w:lastRenderedPageBreak/>
-        <w:t>est en train de chercher, ex : je cherche un médecin disponible le 20/09/2024 à Blida entre 16h et 18h)</w:t>
-      </w:r>
-    </w:p>
+        <w:t>La recherche intelligente (nous mettrons au dispositif de l’utilisateur un outil puissant qui permet d’extraire des informations pertinentes sur le rdv lequel l’utilisateur est en train de chercher, ex : je cherche un médecin disponible le 20/09/2024 à Blida entre 16h et 18h)</w:t>
+      </w:r>
+    </w:p>
+    <w:p/>
     <w:p>
       <w:pPr>
         <w:rPr>
@@ -1362,7 +1732,15 @@
         <w:t xml:space="preserve"> (</w:t>
       </w:r>
       <w:r>
-        <w:t>Soit pour une société donné, soit pour type de service, ) ex : il sélectionne le type de service ‘Carrosserie’ il donne un lieu puis il clique sur le bouton ‘trouver moi le rendez-vous le plus proche’, sinon depuis la fiche d’infos de service xxx , dans la section de prise de rdv il trouve le même bouton pour chercher le rdv le plus proche de ce service</w:t>
+        <w:t>Soit pour une société donné, soit pour type de service</w:t>
+      </w:r>
+      <w:proofErr w:type="gramStart"/>
+      <w:r>
+        <w:t>, )</w:t>
+      </w:r>
+      <w:proofErr w:type="gramEnd"/>
+      <w:r>
+        <w:t xml:space="preserve"> ex : il sélectionne le type de service ‘Carrosserie’ il donne un lieu puis il clique sur le bouton ‘trouver moi le rendez-vous le plus proche’, sinon depuis la fiche d’infos de service xxx , dans la section de prise de rdv il trouve le même bouton pour chercher le rdv le plus proche de ce service</w:t>
       </w:r>
       <w:r>
         <w:t>.</w:t>
@@ -1395,6 +1773,124 @@
       <w:r>
         <w:br/>
       </w:r>
+    </w:p>
+    <w:p>
+      <w:pPr>
+        <w:rPr>
+          <w:b/>
+          <w:bCs/>
+          <w:color w:val="0E2841" w:themeColor="text2"/>
+        </w:rPr>
+      </w:pPr>
+    </w:p>
+    <w:p>
+      <w:pPr>
+        <w:rPr>
+          <w:b/>
+          <w:bCs/>
+          <w:color w:val="0E2841" w:themeColor="text2"/>
+        </w:rPr>
+      </w:pPr>
+    </w:p>
+    <w:p>
+      <w:pPr>
+        <w:rPr>
+          <w:b/>
+          <w:bCs/>
+          <w:color w:val="0E2841" w:themeColor="text2"/>
+        </w:rPr>
+      </w:pPr>
+    </w:p>
+    <w:p>
+      <w:pPr>
+        <w:rPr>
+          <w:b/>
+          <w:bCs/>
+          <w:color w:val="0E2841" w:themeColor="text2"/>
+        </w:rPr>
+      </w:pPr>
+    </w:p>
+    <w:p>
+      <w:pPr>
+        <w:rPr>
+          <w:b/>
+          <w:bCs/>
+          <w:color w:val="0E2841" w:themeColor="text2"/>
+        </w:rPr>
+      </w:pPr>
+      <w:r>
+        <w:rPr>
+          <w:b/>
+          <w:bCs/>
+          <w:color w:val="0E2841" w:themeColor="text2"/>
+        </w:rPr>
+        <w:lastRenderedPageBreak/>
+        <w:t xml:space="preserve">Améliorations : </w:t>
+      </w:r>
+    </w:p>
+    <w:p>
+      <w:pPr>
+        <w:pStyle w:val="ListParagraph"/>
+        <w:numPr>
+          <w:ilvl w:val="0"/>
+          <w:numId w:val="4"/>
+        </w:numPr>
+        <w:rPr>
+          <w:b/>
+          <w:bCs/>
+          <w:color w:val="0E2841" w:themeColor="text2"/>
+        </w:rPr>
+      </w:pPr>
+      <w:r>
+        <w:rPr>
+          <w:b/>
+          <w:bCs/>
+          <w:color w:val="0E2841" w:themeColor="text2"/>
+        </w:rPr>
+        <w:t>Ajouter un motif d’annulation de RDV.</w:t>
+      </w:r>
+    </w:p>
+    <w:p>
+      <w:pPr>
+        <w:pStyle w:val="ListParagraph"/>
+        <w:numPr>
+          <w:ilvl w:val="0"/>
+          <w:numId w:val="4"/>
+        </w:numPr>
+        <w:rPr>
+          <w:b/>
+          <w:bCs/>
+          <w:color w:val="0E2841" w:themeColor="text2"/>
+        </w:rPr>
+      </w:pPr>
+      <w:r>
+        <w:rPr>
+          <w:b/>
+          <w:bCs/>
+          <w:color w:val="0E2841" w:themeColor="text2"/>
+        </w:rPr>
+        <w:t xml:space="preserve">Ajouter </w:t>
+      </w:r>
+      <w:proofErr w:type="spellStart"/>
+      <w:r>
+        <w:rPr>
+          <w:b/>
+          <w:bCs/>
+          <w:color w:val="0E2841" w:themeColor="text2"/>
+        </w:rPr>
+        <w:t>status</w:t>
+      </w:r>
+      <w:proofErr w:type="spellEnd"/>
+      <w:r>
+        <w:rPr>
+          <w:b/>
+          <w:bCs/>
+          <w:color w:val="0E2841" w:themeColor="text2"/>
+        </w:rPr>
+        <w:t xml:space="preserve"> de chaque RDV</w:t>
+      </w:r>
+      <w:bookmarkStart w:id="0" w:name="_GoBack"/>
+      <w:bookmarkEnd w:id="0"/>
     </w:p>
     <w:sectPr>
       <w:pgSz w:w="11906" w:h="16838"/>
@@ -1407,7 +1903,7 @@
 </file>
 
 <file path=word/numbering.xml><?xml version="1.0" encoding="utf-8"?>
-<w:numbering xmlns:wpc="http://schemas.microsoft.com/office/word/2010/wordprocessingCanvas" xmlns:cx="http://schemas.microsoft.com/office/drawing/2014/chartex" xmlns:cx1="http://schemas.microsoft.com/office/drawing/2015/9/8/chartex" xmlns:cx2="http://schemas.microsoft.com/office/drawing/2015/10/21/chartex" xmlns:cx3="http://schemas.microsoft.com/office/drawing/2016/5/9/chartex" xmlns:cx4="http://schemas.microsoft.com/office/drawing/2016/5/10/chartex" xmlns:cx5="http://schemas.microsoft.com/office/drawing/2016/5/11/chartex" xmlns:cx6="http://schemas.microsoft.com/office/drawing/2016/5/12/chartex" xmlns:cx7="http://schemas.microsoft.com/office/drawing/2016/5/13/chartex" xmlns:cx8="http://schemas.microsoft.com/office/drawing/2016/5/14/chartex" xmlns:mc="http://schemas.openxmlformats.org/markup-compatibility/2006" xmlns:aink="http://schemas.microsoft.com/office/drawing/2016/ink" xmlns:am3d="http://schemas.microsoft.com/office/drawing/2017/model3d" xmlns:o="urn:schemas-microsoft-com:office:office" xmlns:oel="http://schemas.microsoft.com/office/2019/extlst" xmlns:r="http://schemas.openxmlformats.org/officeDocument/2006/relationships" xmlns:m="http://schemas.openxmlformats.org/officeDocument/2006/math" xmlns:v="urn:schemas-microsoft-com:vml" xmlns:wp14="http://schemas.microsoft.com/office/word/2010/wordprocessingDrawing" xmlns:wp="http://schemas.openxmlformats.org/drawingml/2006/wordprocessingDrawing" xmlns:w10="urn:schemas-microsoft-com:office:word" xmlns:w="http://schemas.openxmlformats.org/wordprocessingml/2006/main" xmlns:w14="http://schemas.microsoft.com/office/word/2010/wordml" xmlns:w15="http://schemas.microsoft.com/office/word/2012/wordml" xmlns:w16cex="http://schemas.microsoft.com/office/word/2018/wordml/cex" xmlns:w16cid="http://schemas.microsoft.com/office/word/2016/wordml/cid" xmlns:w16="http://schemas.microsoft.com/office/word/2018/wordml" xmlns:w16du="http://schemas.microsoft.com/office/word/2023/wordml/word16du" xmlns:w16sdtdh="http://schemas.microsoft.com/office/word/2020/wordml/sdtdatahash" xmlns:w16sdtfl="http://schemas.microsoft.com/office/word/2024/wordml/sdtformatlock" xmlns:w16se="http://schemas.microsoft.com/office/word/2015/wordml/symex" xmlns:wpg="http://schemas.microsoft.com/office/word/2010/wordprocessingGroup" xmlns:wpi="http://schemas.microsoft.com/office/word/2010/wordprocessingInk" xmlns:wne="http://schemas.microsoft.com/office/word/2006/wordml" xmlns:wps="http://schemas.microsoft.com/office/word/2010/wordprocessingShape" mc:Ignorable="w14 w15 w16se w16cid w16 w16cex w16sdtdh w16sdtfl w16du wp14">
+<w:numbering xmlns:wpc="http://schemas.microsoft.com/office/word/2010/wordprocessingCanvas" xmlns:cx="http://schemas.microsoft.com/office/drawing/2014/chartex" xmlns:cx1="http://schemas.microsoft.com/office/drawing/2015/9/8/chartex" xmlns:mc="http://schemas.openxmlformats.org/markup-compatibility/2006" xmlns:o="urn:schemas-microsoft-com:office:office" xmlns:r="http://schemas.openxmlformats.org/officeDocument/2006/relationships" xmlns:m="http://schemas.openxmlformats.org/officeDocument/2006/math" xmlns:v="urn:schemas-microsoft-com:vml" xmlns:wp14="http://schemas.microsoft.com/office/word/2010/wordprocessingDrawing" xmlns:wp="http://schemas.openxmlformats.org/drawingml/2006/wordprocessingDrawing" xmlns:w10="urn:schemas-microsoft-com:office:word" xmlns:w="http://schemas.openxmlformats.org/wordprocessingml/2006/main" xmlns:w14="http://schemas.microsoft.com/office/word/2010/wordml" xmlns:w15="http://schemas.microsoft.com/office/word/2012/wordml" xmlns:w16se="http://schemas.microsoft.com/office/word/2015/wordml/symex" xmlns:wpg="http://schemas.microsoft.com/office/word/2010/wordprocessingGroup" xmlns:wpi="http://schemas.microsoft.com/office/word/2010/wordprocessingInk" xmlns:wne="http://schemas.microsoft.com/office/word/2006/wordml" xmlns:wps="http://schemas.microsoft.com/office/word/2010/wordprocessingShape" mc:Ignorable="w14 w15 w16se wp14">
   <w:abstractNum w:abstractNumId="0" w15:restartNumberingAfterBreak="0">
     <w:nsid w:val="067D20B1"/>
     <w:multiLevelType w:val="hybridMultilevel"/>
@@ -2377,9 +2873,122 @@
     </w:lvl>
   </w:abstractNum>
   <w:abstractNum w:abstractNumId="9" w15:restartNumberingAfterBreak="0">
+    <w:nsid w:val="3CB12251"/>
+    <w:multiLevelType w:val="hybridMultilevel"/>
+    <w:tmpl w:val="6964B350"/>
+    <w:lvl w:ilvl="0" w:tplc="040C0001">
+      <w:start w:val="1"/>
+      <w:numFmt w:val="bullet"/>
+      <w:lvlText w:val=""/>
+      <w:lvlJc w:val="left"/>
+      <w:pPr>
+        <w:ind w:left="720" w:hanging="360"/>
+      </w:pPr>
+      <w:rPr>
+        <w:rFonts w:ascii="Symbol" w:hAnsi="Symbol" w:hint="default"/>
+      </w:rPr>
+    </w:lvl>
+    <w:lvl w:ilvl="1" w:tplc="040C0003" w:tentative="1">
+      <w:start w:val="1"/>
+      <w:numFmt w:val="bullet"/>
+      <w:lvlText w:val="o"/>
+      <w:lvlJc w:val="left"/>
+      <w:pPr>
+        <w:ind w:left="1440" w:hanging="360"/>
+      </w:pPr>
+      <w:rPr>
+        <w:rFonts w:ascii="Courier New" w:hAnsi="Courier New" w:cs="Courier New" w:hint="default"/>
+      </w:rPr>
+    </w:lvl>
+    <w:lvl w:ilvl="2" w:tplc="040C0005" w:tentative="1">
+      <w:start w:val="1"/>
+      <w:numFmt w:val="bullet"/>
+      <w:lvlText w:val=""/>
+      <w:lvlJc w:val="left"/>
+      <w:pPr>
+        <w:ind w:left="2160" w:hanging="360"/>
+      </w:pPr>
+      <w:rPr>
+        <w:rFonts w:ascii="Wingdings" w:hAnsi="Wingdings" w:hint="default"/>
+      </w:rPr>
+    </w:lvl>
+    <w:lvl w:ilvl="3" w:tplc="040C0001" w:tentative="1">
+      <w:start w:val="1"/>
+      <w:numFmt w:val="bullet"/>
+      <w:lvlText w:val=""/>
+      <w:lvlJc w:val="left"/>
+      <w:pPr>
+        <w:ind w:left="2880" w:hanging="360"/>
+      </w:pPr>
+      <w:rPr>
+        <w:rFonts w:ascii="Symbol" w:hAnsi="Symbol" w:hint="default"/>
+      </w:rPr>
+    </w:lvl>
+    <w:lvl w:ilvl="4" w:tplc="040C0003" w:tentative="1">
+      <w:start w:val="1"/>
+      <w:numFmt w:val="bullet"/>
+      <w:lvlText w:val="o"/>
+      <w:lvlJc w:val="left"/>
+      <w:pPr>
+        <w:ind w:left="3600" w:hanging="360"/>
+      </w:pPr>
+      <w:rPr>
+        <w:rFonts w:ascii="Courier New" w:hAnsi="Courier New" w:cs="Courier New" w:hint="default"/>
+      </w:rPr>
+    </w:lvl>
+    <w:lvl w:ilvl="5" w:tplc="040C0005" w:tentative="1">
+      <w:start w:val="1"/>
+      <w:numFmt w:val="bullet"/>
+      <w:lvlText w:val=""/>
+      <w:lvlJc w:val="left"/>
+      <w:pPr>
+        <w:ind w:left="4320" w:hanging="360"/>
+      </w:pPr>
+      <w:rPr>
+        <w:rFonts w:ascii="Wingdings" w:hAnsi="Wingdings" w:hint="default"/>
+      </w:rPr>
+    </w:lvl>
+    <w:lvl w:ilvl="6" w:tplc="040C0001" w:tentative="1">
+      <w:start w:val="1"/>
+      <w:numFmt w:val="bullet"/>
+      <w:lvlText w:val=""/>
+      <w:lvlJc w:val="left"/>
+      <w:pPr>
+        <w:ind w:left="5040" w:hanging="360"/>
+      </w:pPr>
+      <w:rPr>
+        <w:rFonts w:ascii="Symbol" w:hAnsi="Symbol" w:hint="default"/>
+      </w:rPr>
+    </w:lvl>
+    <w:lvl w:ilvl="7" w:tplc="040C0003" w:tentative="1">
+      <w:start w:val="1"/>
+      <w:numFmt w:val="bullet"/>
+      <w:lvlText w:val="o"/>
+      <w:lvlJc w:val="left"/>
+      <w:pPr>
+        <w:ind w:left="5760" w:hanging="360"/>
+      </w:pPr>
+      <w:rPr>
+        <w:rFonts w:ascii="Courier New" w:hAnsi="Courier New" w:cs="Courier New" w:hint="default"/>
+      </w:rPr>
+    </w:lvl>
+    <w:lvl w:ilvl="8" w:tplc="040C0005" w:tentative="1">
+      <w:start w:val="1"/>
+      <w:numFmt w:val="bullet"/>
+      <w:lvlText w:val=""/>
+      <w:lvlJc w:val="left"/>
+      <w:pPr>
+        <w:ind w:left="6480" w:hanging="360"/>
+      </w:pPr>
+      <w:rPr>
+        <w:rFonts w:ascii="Wingdings" w:hAnsi="Wingdings" w:hint="default"/>
+      </w:rPr>
+    </w:lvl>
+  </w:abstractNum>
+  <w:abstractNum w:abstractNumId="10" w15:restartNumberingAfterBreak="0">
     <w:nsid w:val="3E8F3137"/>
     <w:multiLevelType w:val="hybridMultilevel"/>
-    <w:tmpl w:val="9E62C026"/>
+    <w:tmpl w:val="8F123D48"/>
     <w:lvl w:ilvl="0" w:tplc="040C0001">
       <w:start w:val="1"/>
       <w:numFmt w:val="bullet"/>
@@ -2489,10 +3098,10 @@
       </w:rPr>
     </w:lvl>
   </w:abstractNum>
-  <w:abstractNum w:abstractNumId="10" w15:restartNumberingAfterBreak="0">
+  <w:abstractNum w:abstractNumId="11" w15:restartNumberingAfterBreak="0">
     <w:nsid w:val="57B75B1F"/>
     <w:multiLevelType w:val="hybridMultilevel"/>
-    <w:tmpl w:val="82A6B834"/>
+    <w:tmpl w:val="1F92A306"/>
     <w:lvl w:ilvl="0" w:tplc="4CBEAB34">
       <w:numFmt w:val="bullet"/>
       <w:lvlText w:val="-"/>
@@ -2504,104 +3113,104 @@
         <w:rFonts w:ascii="Aptos" w:eastAsiaTheme="minorHAnsi" w:hAnsi="Aptos" w:cstheme="minorBidi" w:hint="default"/>
       </w:rPr>
     </w:lvl>
-    <w:lvl w:ilvl="1" w:tplc="040C0003" w:tentative="1">
+    <w:lvl w:ilvl="1" w:tplc="040C0001">
+      <w:start w:val="1"/>
+      <w:numFmt w:val="bullet"/>
+      <w:lvlText w:val=""/>
+      <w:lvlJc w:val="left"/>
+      <w:pPr>
+        <w:ind w:left="1460" w:hanging="360"/>
+      </w:pPr>
+      <w:rPr>
+        <w:rFonts w:ascii="Symbol" w:hAnsi="Symbol" w:hint="default"/>
+      </w:rPr>
+    </w:lvl>
+    <w:lvl w:ilvl="2" w:tplc="040C0005" w:tentative="1">
+      <w:start w:val="1"/>
+      <w:numFmt w:val="bullet"/>
+      <w:lvlText w:val=""/>
+      <w:lvlJc w:val="left"/>
+      <w:pPr>
+        <w:ind w:left="2180" w:hanging="360"/>
+      </w:pPr>
+      <w:rPr>
+        <w:rFonts w:ascii="Wingdings" w:hAnsi="Wingdings" w:hint="default"/>
+      </w:rPr>
+    </w:lvl>
+    <w:lvl w:ilvl="3" w:tplc="040C0001" w:tentative="1">
+      <w:start w:val="1"/>
+      <w:numFmt w:val="bullet"/>
+      <w:lvlText w:val=""/>
+      <w:lvlJc w:val="left"/>
+      <w:pPr>
+        <w:ind w:left="2900" w:hanging="360"/>
+      </w:pPr>
+      <w:rPr>
+        <w:rFonts w:ascii="Symbol" w:hAnsi="Symbol" w:hint="default"/>
+      </w:rPr>
+    </w:lvl>
+    <w:lvl w:ilvl="4" w:tplc="040C0003" w:tentative="1">
       <w:start w:val="1"/>
       <w:numFmt w:val="bullet"/>
       <w:lvlText w:val="o"/>
       <w:lvlJc w:val="left"/>
       <w:pPr>
-        <w:ind w:left="1460" w:hanging="360"/>
+        <w:ind w:left="3620" w:hanging="360"/>
       </w:pPr>
       <w:rPr>
         <w:rFonts w:ascii="Courier New" w:hAnsi="Courier New" w:cs="Courier New" w:hint="default"/>
       </w:rPr>
     </w:lvl>
-    <w:lvl w:ilvl="2" w:tplc="040C0005" w:tentative="1">
+    <w:lvl w:ilvl="5" w:tplc="040C0005" w:tentative="1">
       <w:start w:val="1"/>
       <w:numFmt w:val="bullet"/>
       <w:lvlText w:val=""/>
       <w:lvlJc w:val="left"/>
       <w:pPr>
-        <w:ind w:left="2180" w:hanging="360"/>
+        <w:ind w:left="4340" w:hanging="360"/>
       </w:pPr>
       <w:rPr>
         <w:rFonts w:ascii="Wingdings" w:hAnsi="Wingdings" w:hint="default"/>
       </w:rPr>
     </w:lvl>
-    <w:lvl w:ilvl="3" w:tplc="040C0001" w:tentative="1">
+    <w:lvl w:ilvl="6" w:tplc="040C0001" w:tentative="1">
       <w:start w:val="1"/>
       <w:numFmt w:val="bullet"/>
       <w:lvlText w:val=""/>
       <w:lvlJc w:val="left"/>
       <w:pPr>
-        <w:ind w:left="2900" w:hanging="360"/>
+        <w:ind w:left="5060" w:hanging="360"/>
       </w:pPr>
       <w:rPr>
         <w:rFonts w:ascii="Symbol" w:hAnsi="Symbol" w:hint="default"/>
       </w:rPr>
     </w:lvl>
-    <w:lvl w:ilvl="4" w:tplc="040C0003" w:tentative="1">
+    <w:lvl w:ilvl="7" w:tplc="040C0003" w:tentative="1">
       <w:start w:val="1"/>
       <w:numFmt w:val="bullet"/>
       <w:lvlText w:val="o"/>
       <w:lvlJc w:val="left"/>
       <w:pPr>
-        <w:ind w:left="3620" w:hanging="360"/>
+        <w:ind w:left="5780" w:hanging="360"/>
       </w:pPr>
       <w:rPr>
         <w:rFonts w:ascii="Courier New" w:hAnsi="Courier New" w:cs="Courier New" w:hint="default"/>
       </w:rPr>
     </w:lvl>
-    <w:lvl w:ilvl="5" w:tplc="040C0005" w:tentative="1">
+    <w:lvl w:ilvl="8" w:tplc="040C0005" w:tentative="1">
       <w:start w:val="1"/>
       <w:numFmt w:val="bullet"/>
       <w:lvlText w:val=""/>
       <w:lvlJc w:val="left"/>
       <w:pPr>
-        <w:ind w:left="4340" w:hanging="360"/>
+        <w:ind w:left="6500" w:hanging="360"/>
       </w:pPr>
       <w:rPr>
         <w:rFonts w:ascii="Wingdings" w:hAnsi="Wingdings" w:hint="default"/>
       </w:rPr>
     </w:lvl>
-    <w:lvl w:ilvl="6" w:tplc="040C0001" w:tentative="1">
-      <w:start w:val="1"/>
-      <w:numFmt w:val="bullet"/>
-      <w:lvlText w:val=""/>
-      <w:lvlJc w:val="left"/>
-      <w:pPr>
-        <w:ind w:left="5060" w:hanging="360"/>
-      </w:pPr>
-      <w:rPr>
-        <w:rFonts w:ascii="Symbol" w:hAnsi="Symbol" w:hint="default"/>
-      </w:rPr>
-    </w:lvl>
-    <w:lvl w:ilvl="7" w:tplc="040C0003" w:tentative="1">
-      <w:start w:val="1"/>
-      <w:numFmt w:val="bullet"/>
-      <w:lvlText w:val="o"/>
-      <w:lvlJc w:val="left"/>
-      <w:pPr>
-        <w:ind w:left="5780" w:hanging="360"/>
-      </w:pPr>
-      <w:rPr>
-        <w:rFonts w:ascii="Courier New" w:hAnsi="Courier New" w:cs="Courier New" w:hint="default"/>
-      </w:rPr>
-    </w:lvl>
-    <w:lvl w:ilvl="8" w:tplc="040C0005" w:tentative="1">
-      <w:start w:val="1"/>
-      <w:numFmt w:val="bullet"/>
-      <w:lvlText w:val=""/>
-      <w:lvlJc w:val="left"/>
-      <w:pPr>
-        <w:ind w:left="6500" w:hanging="360"/>
-      </w:pPr>
-      <w:rPr>
-        <w:rFonts w:ascii="Wingdings" w:hAnsi="Wingdings" w:hint="default"/>
-      </w:rPr>
-    </w:lvl>
   </w:abstractNum>
-  <w:abstractNum w:abstractNumId="11" w15:restartNumberingAfterBreak="0">
+  <w:abstractNum w:abstractNumId="12" w15:restartNumberingAfterBreak="0">
     <w:nsid w:val="7CB45DB6"/>
     <w:multiLevelType w:val="hybridMultilevel"/>
     <w:tmpl w:val="A322E3C0"/>
@@ -2713,47 +3322,50 @@
       </w:rPr>
     </w:lvl>
   </w:abstractNum>
-  <w:num w:numId="1" w16cid:durableId="842818907">
+  <w:num w:numId="1">
     <w:abstractNumId w:val="8"/>
   </w:num>
-  <w:num w:numId="2" w16cid:durableId="38019239">
+  <w:num w:numId="2">
     <w:abstractNumId w:val="3"/>
   </w:num>
-  <w:num w:numId="3" w16cid:durableId="1498154576">
+  <w:num w:numId="3">
     <w:abstractNumId w:val="4"/>
   </w:num>
-  <w:num w:numId="4" w16cid:durableId="1429544892">
+  <w:num w:numId="4">
+    <w:abstractNumId w:val="11"/>
+  </w:num>
+  <w:num w:numId="5">
+    <w:abstractNumId w:val="2"/>
+  </w:num>
+  <w:num w:numId="6">
+    <w:abstractNumId w:val="5"/>
+  </w:num>
+  <w:num w:numId="7">
+    <w:abstractNumId w:val="7"/>
+  </w:num>
+  <w:num w:numId="8">
+    <w:abstractNumId w:val="6"/>
+  </w:num>
+  <w:num w:numId="9">
+    <w:abstractNumId w:val="0"/>
+  </w:num>
+  <w:num w:numId="10">
+    <w:abstractNumId w:val="12"/>
+  </w:num>
+  <w:num w:numId="11">
+    <w:abstractNumId w:val="1"/>
+  </w:num>
+  <w:num w:numId="12">
     <w:abstractNumId w:val="10"/>
   </w:num>
-  <w:num w:numId="5" w16cid:durableId="1302660273">
-    <w:abstractNumId w:val="2"/>
-  </w:num>
-  <w:num w:numId="6" w16cid:durableId="2041129354">
-    <w:abstractNumId w:val="5"/>
-  </w:num>
-  <w:num w:numId="7" w16cid:durableId="2121365244">
-    <w:abstractNumId w:val="7"/>
-  </w:num>
-  <w:num w:numId="8" w16cid:durableId="735082994">
-    <w:abstractNumId w:val="6"/>
-  </w:num>
-  <w:num w:numId="9" w16cid:durableId="289284518">
-    <w:abstractNumId w:val="0"/>
-  </w:num>
-  <w:num w:numId="10" w16cid:durableId="2116174141">
-    <w:abstractNumId w:val="11"/>
-  </w:num>
-  <w:num w:numId="11" w16cid:durableId="350960177">
-    <w:abstractNumId w:val="1"/>
-  </w:num>
-  <w:num w:numId="12" w16cid:durableId="1305311798">
+  <w:num w:numId="13">
     <w:abstractNumId w:val="9"/>
   </w:num>
 </w:numbering>
 </file>
 
 <file path=word/styles.xml><?xml version="1.0" encoding="utf-8"?>
-<w:styles xmlns:mc="http://schemas.openxmlformats.org/markup-compatibility/2006" xmlns:r="http://schemas.openxmlformats.org/officeDocument/2006/relationships" xmlns:w="http://schemas.openxmlformats.org/wordprocessingml/2006/main" xmlns:w14="http://schemas.microsoft.com/office/word/2010/wordml" xmlns:w15="http://schemas.microsoft.com/office/word/2012/wordml" xmlns:w16cex="http://schemas.microsoft.com/office/word/2018/wordml/cex" xmlns:w16cid="http://schemas.microsoft.com/office/word/2016/wordml/cid" xmlns:w16="http://schemas.microsoft.com/office/word/2018/wordml" xmlns:w16du="http://schemas.microsoft.com/office/word/2023/wordml/word16du" xmlns:w16sdtdh="http://schemas.microsoft.com/office/word/2020/wordml/sdtdatahash" xmlns:w16sdtfl="http://schemas.microsoft.com/office/word/2024/wordml/sdtformatlock" xmlns:w16se="http://schemas.microsoft.com/office/word/2015/wordml/symex" mc:Ignorable="w14 w15 w16se w16cid w16 w16cex w16sdtdh w16sdtfl w16du">
+<w:styles xmlns:mc="http://schemas.openxmlformats.org/markup-compatibility/2006" xmlns:r="http://schemas.openxmlformats.org/officeDocument/2006/relationships" xmlns:w="http://schemas.openxmlformats.org/wordprocessingml/2006/main" xmlns:w14="http://schemas.microsoft.com/office/word/2010/wordml" xmlns:w15="http://schemas.microsoft.com/office/word/2012/wordml" xmlns:w16se="http://schemas.microsoft.com/office/word/2015/wordml/symex" mc:Ignorable="w14 w15 w16se">
   <w:docDefaults>
     <w:rPrDefault>
       <w:rPr>
@@ -2771,7 +3383,7 @@
       </w:pPr>
     </w:pPrDefault>
   </w:docDefaults>
-  <w:latentStyles w:defLockedState="0" w:defUIPriority="99" w:defSemiHidden="0" w:defUnhideWhenUsed="0" w:defQFormat="0" w:count="376">
+  <w:latentStyles w:defLockedState="0" w:defUIPriority="99" w:defSemiHidden="0" w:defUnhideWhenUsed="0" w:defQFormat="0" w:count="371">
     <w:lsdException w:name="Normal" w:uiPriority="0" w:qFormat="1"/>
     <w:lsdException w:name="heading 1" w:uiPriority="9" w:qFormat="1"/>
     <w:lsdException w:name="heading 2" w:semiHidden="1" w:uiPriority="9" w:unhideWhenUsed="1" w:qFormat="1"/>
@@ -3143,21 +3755,16 @@
     <w:lsdException w:name="List Table 5 Dark Accent 6" w:uiPriority="50"/>
     <w:lsdException w:name="List Table 6 Colorful Accent 6" w:uiPriority="51"/>
     <w:lsdException w:name="List Table 7 Colorful Accent 6" w:uiPriority="52"/>
-    <w:lsdException w:name="Mention" w:semiHidden="1" w:unhideWhenUsed="1"/>
-    <w:lsdException w:name="Smart Hyperlink" w:semiHidden="1" w:unhideWhenUsed="1"/>
-    <w:lsdException w:name="Hashtag" w:semiHidden="1" w:unhideWhenUsed="1"/>
-    <w:lsdException w:name="Unresolved Mention" w:semiHidden="1" w:unhideWhenUsed="1"/>
-    <w:lsdException w:name="Smart Link" w:semiHidden="1" w:unhideWhenUsed="1"/>
   </w:latentStyles>
   <w:style w:type="paragraph" w:default="1" w:styleId="Normal">
     <w:name w:val="Normal"/>
     <w:qFormat/>
   </w:style>
-  <w:style w:type="paragraph" w:styleId="Titre1">
+  <w:style w:type="paragraph" w:styleId="Heading1">
     <w:name w:val="heading 1"/>
     <w:basedOn w:val="Normal"/>
     <w:next w:val="Normal"/>
-    <w:link w:val="Titre1Car"/>
+    <w:link w:val="Heading1Char"/>
     <w:uiPriority w:val="9"/>
     <w:qFormat/>
     <w:rsid w:val="005B7187"/>
@@ -3174,11 +3781,11 @@
       <w:szCs w:val="40"/>
     </w:rPr>
   </w:style>
-  <w:style w:type="paragraph" w:styleId="Titre2">
+  <w:style w:type="paragraph" w:styleId="Heading2">
     <w:name w:val="heading 2"/>
     <w:basedOn w:val="Normal"/>
     <w:next w:val="Normal"/>
-    <w:link w:val="Titre2Car"/>
+    <w:link w:val="Heading2Char"/>
     <w:uiPriority w:val="9"/>
     <w:semiHidden/>
     <w:unhideWhenUsed/>
@@ -3197,11 +3804,11 @@
       <w:szCs w:val="32"/>
     </w:rPr>
   </w:style>
-  <w:style w:type="paragraph" w:styleId="Titre3">
+  <w:style w:type="paragraph" w:styleId="Heading3">
     <w:name w:val="heading 3"/>
     <w:basedOn w:val="Normal"/>
     <w:next w:val="Normal"/>
-    <w:link w:val="Titre3Car"/>
+    <w:link w:val="Heading3Char"/>
     <w:uiPriority w:val="9"/>
     <w:semiHidden/>
     <w:unhideWhenUsed/>
@@ -3220,11 +3827,11 @@
       <w:szCs w:val="28"/>
     </w:rPr>
   </w:style>
-  <w:style w:type="paragraph" w:styleId="Titre4">
+  <w:style w:type="paragraph" w:styleId="Heading4">
     <w:name w:val="heading 4"/>
     <w:basedOn w:val="Normal"/>
     <w:next w:val="Normal"/>
-    <w:link w:val="Titre4Car"/>
+    <w:link w:val="Heading4Char"/>
     <w:uiPriority w:val="9"/>
     <w:semiHidden/>
     <w:unhideWhenUsed/>
@@ -3243,11 +3850,11 @@
       <w:color w:val="0F4761" w:themeColor="accent1" w:themeShade="BF"/>
     </w:rPr>
   </w:style>
-  <w:style w:type="paragraph" w:styleId="Titre5">
+  <w:style w:type="paragraph" w:styleId="Heading5">
     <w:name w:val="heading 5"/>
     <w:basedOn w:val="Normal"/>
     <w:next w:val="Normal"/>
-    <w:link w:val="Titre5Car"/>
+    <w:link w:val="Heading5Char"/>
     <w:uiPriority w:val="9"/>
     <w:semiHidden/>
     <w:unhideWhenUsed/>
@@ -3264,11 +3871,11 @@
       <w:color w:val="0F4761" w:themeColor="accent1" w:themeShade="BF"/>
     </w:rPr>
   </w:style>
-  <w:style w:type="paragraph" w:styleId="Titre6">
+  <w:style w:type="paragraph" w:styleId="Heading6">
     <w:name w:val="heading 6"/>
     <w:basedOn w:val="Normal"/>
     <w:next w:val="Normal"/>
-    <w:link w:val="Titre6Car"/>
+    <w:link w:val="Heading6Char"/>
     <w:uiPriority w:val="9"/>
     <w:semiHidden/>
     <w:unhideWhenUsed/>
@@ -3287,11 +3894,11 @@
       <w:color w:val="595959" w:themeColor="text1" w:themeTint="A6"/>
     </w:rPr>
   </w:style>
-  <w:style w:type="paragraph" w:styleId="Titre7">
+  <w:style w:type="paragraph" w:styleId="Heading7">
     <w:name w:val="heading 7"/>
     <w:basedOn w:val="Normal"/>
     <w:next w:val="Normal"/>
-    <w:link w:val="Titre7Car"/>
+    <w:link w:val="Heading7Char"/>
     <w:uiPriority w:val="9"/>
     <w:semiHidden/>
     <w:unhideWhenUsed/>
@@ -3308,11 +3915,11 @@
       <w:color w:val="595959" w:themeColor="text1" w:themeTint="A6"/>
     </w:rPr>
   </w:style>
-  <w:style w:type="paragraph" w:styleId="Titre8">
+  <w:style w:type="paragraph" w:styleId="Heading8">
     <w:name w:val="heading 8"/>
     <w:basedOn w:val="Normal"/>
     <w:next w:val="Normal"/>
-    <w:link w:val="Titre8Car"/>
+    <w:link w:val="Heading8Char"/>
     <w:uiPriority w:val="9"/>
     <w:semiHidden/>
     <w:unhideWhenUsed/>
@@ -3331,11 +3938,11 @@
       <w:color w:val="272727" w:themeColor="text1" w:themeTint="D8"/>
     </w:rPr>
   </w:style>
-  <w:style w:type="paragraph" w:styleId="Titre9">
+  <w:style w:type="paragraph" w:styleId="Heading9">
     <w:name w:val="heading 9"/>
     <w:basedOn w:val="Normal"/>
     <w:next w:val="Normal"/>
-    <w:link w:val="Titre9Car"/>
+    <w:link w:val="Heading9Char"/>
     <w:uiPriority w:val="9"/>
     <w:semiHidden/>
     <w:unhideWhenUsed/>
@@ -3352,13 +3959,13 @@
       <w:color w:val="272727" w:themeColor="text1" w:themeTint="D8"/>
     </w:rPr>
   </w:style>
-  <w:style w:type="character" w:default="1" w:styleId="Policepardfaut">
+  <w:style w:type="character" w:default="1" w:styleId="DefaultParagraphFont">
     <w:name w:val="Default Paragraph Font"/>
     <w:uiPriority w:val="1"/>
     <w:semiHidden/>
     <w:unhideWhenUsed/>
   </w:style>
-  <w:style w:type="table" w:default="1" w:styleId="TableauNormal">
+  <w:style w:type="table" w:default="1" w:styleId="TableNormal">
     <w:name w:val="Normal Table"/>
     <w:uiPriority w:val="99"/>
     <w:semiHidden/>
@@ -3373,16 +3980,16 @@
       </w:tblCellMar>
     </w:tblPr>
   </w:style>
-  <w:style w:type="numbering" w:default="1" w:styleId="Aucuneliste">
+  <w:style w:type="numbering" w:default="1" w:styleId="NoList">
     <w:name w:val="No List"/>
     <w:uiPriority w:val="99"/>
     <w:semiHidden/>
     <w:unhideWhenUsed/>
   </w:style>
-  <w:style w:type="character" w:customStyle="1" w:styleId="Titre1Car">
-    <w:name w:val="Titre 1 Car"/>
-    <w:basedOn w:val="Policepardfaut"/>
-    <w:link w:val="Titre1"/>
+  <w:style w:type="character" w:customStyle="1" w:styleId="Heading1Char">
+    <w:name w:val="Heading 1 Char"/>
+    <w:basedOn w:val="DefaultParagraphFont"/>
+    <w:link w:val="Heading1"/>
     <w:uiPriority w:val="9"/>
     <w:rsid w:val="005B7187"/>
     <w:rPr>
@@ -3392,10 +3999,10 @@
       <w:szCs w:val="40"/>
     </w:rPr>
   </w:style>
-  <w:style w:type="character" w:customStyle="1" w:styleId="Titre2Car">
-    <w:name w:val="Titre 2 Car"/>
-    <w:basedOn w:val="Policepardfaut"/>
-    <w:link w:val="Titre2"/>
+  <w:style w:type="character" w:customStyle="1" w:styleId="Heading2Char">
+    <w:name w:val="Heading 2 Char"/>
+    <w:basedOn w:val="DefaultParagraphFont"/>
+    <w:link w:val="Heading2"/>
     <w:uiPriority w:val="9"/>
     <w:semiHidden/>
     <w:rsid w:val="005B7187"/>
@@ -3406,10 +4013,10 @@
       <w:szCs w:val="32"/>
     </w:rPr>
   </w:style>
-  <w:style w:type="character" w:customStyle="1" w:styleId="Titre3Car">
-    <w:name w:val="Titre 3 Car"/>
-    <w:basedOn w:val="Policepardfaut"/>
-    <w:link w:val="Titre3"/>
+  <w:style w:type="character" w:customStyle="1" w:styleId="Heading3Char">
+    <w:name w:val="Heading 3 Char"/>
+    <w:basedOn w:val="DefaultParagraphFont"/>
+    <w:link w:val="Heading3"/>
     <w:uiPriority w:val="9"/>
     <w:semiHidden/>
     <w:rsid w:val="005B7187"/>
@@ -3420,10 +4027,10 @@
       <w:szCs w:val="28"/>
     </w:rPr>
   </w:style>
-  <w:style w:type="character" w:customStyle="1" w:styleId="Titre4Car">
-    <w:name w:val="Titre 4 Car"/>
-    <w:basedOn w:val="Policepardfaut"/>
-    <w:link w:val="Titre4"/>
+  <w:style w:type="character" w:customStyle="1" w:styleId="Heading4Char">
+    <w:name w:val="Heading 4 Char"/>
+    <w:basedOn w:val="DefaultParagraphFont"/>
+    <w:link w:val="Heading4"/>
     <w:uiPriority w:val="9"/>
     <w:semiHidden/>
     <w:rsid w:val="005B7187"/>
@@ -3434,10 +4041,10 @@
       <w:color w:val="0F4761" w:themeColor="accent1" w:themeShade="BF"/>
     </w:rPr>
   </w:style>
-  <w:style w:type="character" w:customStyle="1" w:styleId="Titre5Car">
-    <w:name w:val="Titre 5 Car"/>
-    <w:basedOn w:val="Policepardfaut"/>
-    <w:link w:val="Titre5"/>
+  <w:style w:type="character" w:customStyle="1" w:styleId="Heading5Char">
+    <w:name w:val="Heading 5 Char"/>
+    <w:basedOn w:val="DefaultParagraphFont"/>
+    <w:link w:val="Heading5"/>
     <w:uiPriority w:val="9"/>
     <w:semiHidden/>
     <w:rsid w:val="005B7187"/>
@@ -3446,10 +4053,10 @@
       <w:color w:val="0F4761" w:themeColor="accent1" w:themeShade="BF"/>
     </w:rPr>
   </w:style>
-  <w:style w:type="character" w:customStyle="1" w:styleId="Titre6Car">
-    <w:name w:val="Titre 6 Car"/>
-    <w:basedOn w:val="Policepardfaut"/>
-    <w:link w:val="Titre6"/>
+  <w:style w:type="character" w:customStyle="1" w:styleId="Heading6Char">
+    <w:name w:val="Heading 6 Char"/>
+    <w:basedOn w:val="DefaultParagraphFont"/>
+    <w:link w:val="Heading6"/>
     <w:uiPriority w:val="9"/>
     <w:semiHidden/>
     <w:rsid w:val="005B7187"/>
@@ -3460,10 +4067,10 @@
       <w:color w:val="595959" w:themeColor="text1" w:themeTint="A6"/>
     </w:rPr>
   </w:style>
-  <w:style w:type="character" w:customStyle="1" w:styleId="Titre7Car">
-    <w:name w:val="Titre 7 Car"/>
-    <w:basedOn w:val="Policepardfaut"/>
-    <w:link w:val="Titre7"/>
+  <w:style w:type="character" w:customStyle="1" w:styleId="Heading7Char">
+    <w:name w:val="Heading 7 Char"/>
+    <w:basedOn w:val="DefaultParagraphFont"/>
+    <w:link w:val="Heading7"/>
     <w:uiPriority w:val="9"/>
     <w:semiHidden/>
     <w:rsid w:val="005B7187"/>
@@ -3472,10 +4079,10 @@
       <w:color w:val="595959" w:themeColor="text1" w:themeTint="A6"/>
     </w:rPr>
   </w:style>
-  <w:style w:type="character" w:customStyle="1" w:styleId="Titre8Car">
-    <w:name w:val="Titre 8 Car"/>
-    <w:basedOn w:val="Policepardfaut"/>
-    <w:link w:val="Titre8"/>
+  <w:style w:type="character" w:customStyle="1" w:styleId="Heading8Char">
+    <w:name w:val="Heading 8 Char"/>
+    <w:basedOn w:val="DefaultParagraphFont"/>
+    <w:link w:val="Heading8"/>
     <w:uiPriority w:val="9"/>
     <w:semiHidden/>
     <w:rsid w:val="005B7187"/>
@@ -3486,10 +4093,10 @@
       <w:color w:val="272727" w:themeColor="text1" w:themeTint="D8"/>
     </w:rPr>
   </w:style>
-  <w:style w:type="character" w:customStyle="1" w:styleId="Titre9Car">
-    <w:name w:val="Titre 9 Car"/>
-    <w:basedOn w:val="Policepardfaut"/>
-    <w:link w:val="Titre9"/>
+  <w:style w:type="character" w:customStyle="1" w:styleId="Heading9Char">
+    <w:name w:val="Heading 9 Char"/>
+    <w:basedOn w:val="DefaultParagraphFont"/>
+    <w:link w:val="Heading9"/>
     <w:uiPriority w:val="9"/>
     <w:semiHidden/>
     <w:rsid w:val="005B7187"/>
@@ -3498,11 +4105,11 @@
       <w:color w:val="272727" w:themeColor="text1" w:themeTint="D8"/>
     </w:rPr>
   </w:style>
-  <w:style w:type="paragraph" w:styleId="Titre">
+  <w:style w:type="paragraph" w:styleId="Title">
     <w:name w:val="Title"/>
     <w:basedOn w:val="Normal"/>
     <w:next w:val="Normal"/>
-    <w:link w:val="TitreCar"/>
+    <w:link w:val="TitleChar"/>
     <w:uiPriority w:val="10"/>
     <w:qFormat/>
     <w:rsid w:val="005B7187"/>
@@ -3518,10 +4125,10 @@
       <w:szCs w:val="56"/>
     </w:rPr>
   </w:style>
-  <w:style w:type="character" w:customStyle="1" w:styleId="TitreCar">
-    <w:name w:val="Titre Car"/>
-    <w:basedOn w:val="Policepardfaut"/>
-    <w:link w:val="Titre"/>
+  <w:style w:type="character" w:customStyle="1" w:styleId="TitleChar">
+    <w:name w:val="Title Char"/>
+    <w:basedOn w:val="DefaultParagraphFont"/>
+    <w:link w:val="Title"/>
     <w:uiPriority w:val="10"/>
     <w:rsid w:val="005B7187"/>
     <w:rPr>
@@ -3532,11 +4139,11 @@
       <w:szCs w:val="56"/>
     </w:rPr>
   </w:style>
-  <w:style w:type="paragraph" w:styleId="Sous-titre">
+  <w:style w:type="paragraph" w:styleId="Subtitle">
     <w:name w:val="Subtitle"/>
     <w:basedOn w:val="Normal"/>
     <w:next w:val="Normal"/>
-    <w:link w:val="Sous-titreCar"/>
+    <w:link w:val="SubtitleChar"/>
     <w:uiPriority w:val="11"/>
     <w:qFormat/>
     <w:rsid w:val="005B7187"/>
@@ -3553,10 +4160,10 @@
       <w:szCs w:val="28"/>
     </w:rPr>
   </w:style>
-  <w:style w:type="character" w:customStyle="1" w:styleId="Sous-titreCar">
-    <w:name w:val="Sous-titre Car"/>
-    <w:basedOn w:val="Policepardfaut"/>
-    <w:link w:val="Sous-titre"/>
+  <w:style w:type="character" w:customStyle="1" w:styleId="SubtitleChar">
+    <w:name w:val="Subtitle Char"/>
+    <w:basedOn w:val="DefaultParagraphFont"/>
+    <w:link w:val="Subtitle"/>
     <w:uiPriority w:val="11"/>
     <w:rsid w:val="005B7187"/>
     <w:rPr>
@@ -3567,11 +4174,11 @@
       <w:szCs w:val="28"/>
     </w:rPr>
   </w:style>
-  <w:style w:type="paragraph" w:styleId="Citation">
+  <w:style w:type="paragraph" w:styleId="Quote">
     <w:name w:val="Quote"/>
     <w:basedOn w:val="Normal"/>
     <w:next w:val="Normal"/>
-    <w:link w:val="CitationCar"/>
+    <w:link w:val="QuoteChar"/>
     <w:uiPriority w:val="29"/>
     <w:qFormat/>
     <w:rsid w:val="005B7187"/>
@@ -3585,10 +4192,10 @@
       <w:color w:val="404040" w:themeColor="text1" w:themeTint="BF"/>
     </w:rPr>
   </w:style>
-  <w:style w:type="character" w:customStyle="1" w:styleId="CitationCar">
-    <w:name w:val="Citation Car"/>
-    <w:basedOn w:val="Policepardfaut"/>
-    <w:link w:val="Citation"/>
+  <w:style w:type="character" w:customStyle="1" w:styleId="QuoteChar">
+    <w:name w:val="Quote Char"/>
+    <w:basedOn w:val="DefaultParagraphFont"/>
+    <w:link w:val="Quote"/>
     <w:uiPriority w:val="29"/>
     <w:rsid w:val="005B7187"/>
     <w:rPr>
@@ -3597,7 +4204,7 @@
       <w:color w:val="404040" w:themeColor="text1" w:themeTint="BF"/>
     </w:rPr>
   </w:style>
-  <w:style w:type="paragraph" w:styleId="Paragraphedeliste">
+  <w:style w:type="paragraph" w:styleId="ListParagraph">
     <w:name w:val="List Paragraph"/>
     <w:basedOn w:val="Normal"/>
     <w:uiPriority w:val="34"/>
@@ -3608,9 +4215,9 @@
       <w:contextualSpacing/>
     </w:pPr>
   </w:style>
-  <w:style w:type="character" w:styleId="Accentuationintense">
+  <w:style w:type="character" w:styleId="IntenseEmphasis">
     <w:name w:val="Intense Emphasis"/>
-    <w:basedOn w:val="Policepardfaut"/>
+    <w:basedOn w:val="DefaultParagraphFont"/>
     <w:uiPriority w:val="21"/>
     <w:qFormat/>
     <w:rsid w:val="005B7187"/>
@@ -3620,11 +4227,11 @@
       <w:color w:val="0F4761" w:themeColor="accent1" w:themeShade="BF"/>
     </w:rPr>
   </w:style>
-  <w:style w:type="paragraph" w:styleId="Citationintense">
+  <w:style w:type="paragraph" w:styleId="IntenseQuote">
     <w:name w:val="Intense Quote"/>
     <w:basedOn w:val="Normal"/>
     <w:next w:val="Normal"/>
-    <w:link w:val="CitationintenseCar"/>
+    <w:link w:val="IntenseQuoteChar"/>
     <w:uiPriority w:val="30"/>
     <w:qFormat/>
     <w:rsid w:val="005B7187"/>
@@ -3643,10 +4250,10 @@
       <w:color w:val="0F4761" w:themeColor="accent1" w:themeShade="BF"/>
     </w:rPr>
   </w:style>
-  <w:style w:type="character" w:customStyle="1" w:styleId="CitationintenseCar">
-    <w:name w:val="Citation intense Car"/>
-    <w:basedOn w:val="Policepardfaut"/>
-    <w:link w:val="Citationintense"/>
+  <w:style w:type="character" w:customStyle="1" w:styleId="IntenseQuoteChar">
+    <w:name w:val="Intense Quote Char"/>
+    <w:basedOn w:val="DefaultParagraphFont"/>
+    <w:link w:val="IntenseQuote"/>
     <w:uiPriority w:val="30"/>
     <w:rsid w:val="005B7187"/>
     <w:rPr>
@@ -3655,9 +4262,9 @@
       <w:color w:val="0F4761" w:themeColor="accent1" w:themeShade="BF"/>
     </w:rPr>
   </w:style>
-  <w:style w:type="character" w:styleId="Rfrenceintense">
+  <w:style w:type="character" w:styleId="IntenseReference">
     <w:name w:val="Intense Reference"/>
-    <w:basedOn w:val="Policepardfaut"/>
+    <w:basedOn w:val="DefaultParagraphFont"/>
     <w:uiPriority w:val="32"/>
     <w:qFormat/>
     <w:rsid w:val="005B7187"/>

</xml_diff>